<commit_message>
Se agregaron 4 Apellidos
</commit_message>
<xml_diff>
--- a/Apellidos.docx
+++ b/Apellidos.docx
@@ -156,6 +156,87 @@
         </w:rPr>
         <w:t>Cabrera</w:t>
       </w:r>
+    </w:p>
+    <w:p>
+      <w:pPr>
+        <w:rPr>
+          <w:sz w:val="32"/>
+          <w:szCs w:val="32"/>
+          <w:lang w:val="es-ES"/>
+        </w:rPr>
+      </w:pPr>
+      <w:proofErr w:type="spellStart"/>
+      <w:r>
+        <w:rPr>
+          <w:sz w:val="32"/>
+          <w:szCs w:val="32"/>
+          <w:lang w:val="es-ES"/>
+        </w:rPr>
+        <w:t>Arrigui</w:t>
+      </w:r>
+      <w:proofErr w:type="spellEnd"/>
+    </w:p>
+    <w:p>
+      <w:pPr>
+        <w:rPr>
+          <w:sz w:val="32"/>
+          <w:szCs w:val="32"/>
+          <w:lang w:val="es-ES"/>
+        </w:rPr>
+      </w:pPr>
+      <w:proofErr w:type="spellStart"/>
+      <w:r>
+        <w:rPr>
+          <w:sz w:val="32"/>
+          <w:szCs w:val="32"/>
+          <w:lang w:val="es-ES"/>
+        </w:rPr>
+        <w:t>Calapsu</w:t>
+      </w:r>
+      <w:proofErr w:type="spellEnd"/>
+    </w:p>
+    <w:p>
+      <w:pPr>
+        <w:rPr>
+          <w:sz w:val="32"/>
+          <w:szCs w:val="32"/>
+          <w:lang w:val="es-ES"/>
+        </w:rPr>
+      </w:pPr>
+      <w:r>
+        <w:rPr>
+          <w:sz w:val="32"/>
+          <w:szCs w:val="32"/>
+          <w:lang w:val="es-ES"/>
+        </w:rPr>
+        <w:t>Díaz</w:t>
+      </w:r>
+    </w:p>
+    <w:p>
+      <w:pPr>
+        <w:rPr>
+          <w:sz w:val="32"/>
+          <w:szCs w:val="32"/>
+          <w:lang w:val="es-ES"/>
+        </w:rPr>
+      </w:pPr>
+      <w:r>
+        <w:rPr>
+          <w:sz w:val="32"/>
+          <w:szCs w:val="32"/>
+          <w:lang w:val="es-ES"/>
+        </w:rPr>
+        <w:t>Oviedo</w:t>
+      </w:r>
+    </w:p>
+    <w:p>
+      <w:pPr>
+        <w:rPr>
+          <w:sz w:val="32"/>
+          <w:szCs w:val="32"/>
+          <w:lang w:val="es-ES"/>
+        </w:rPr>
+      </w:pPr>
     </w:p>
     <w:p>
       <w:pPr>

</xml_diff>